<commit_message>
Libros: las páginas de respiro sin «THE CHANNEL» (solo la firma de Julián)
Por pedido de Lucas, en los libros no se aclara que los textos salen de THE
CHANNEL; eso queda solo en el sitio.

Co-Authored-By: Claude Opus 5.5 <noreply@anthropic.com>
Claude-Session: https://claude.ai/code/session_014ZXCqSPyLGg43e9ivReU3y
</commit_message>
<xml_diff>
--- a/manuscritos/El Pensamiento es Tu Fe (edición integral con sitio, revisión 4).docx
+++ b/manuscritos/El Pensamiento es Tu Fe (edición integral con sitio, revisión 4).docx
@@ -1963,7 +1963,7 @@
           <w:szCs w:val="14"/>
           <w:lang w:val="es-AR"/>
         </w:rPr>
-        <w:t xml:space="preserve">JULIÁN BERMÚDEZ · THE CHANNEL</w:t>
+        <w:t xml:space="preserve">JULIÁN BERMÚDEZ</w:t>
       </w:r>
     </w:p>
     <w:p>
@@ -2801,7 +2801,7 @@
           <w:szCs w:val="14"/>
           <w:lang w:val="es-AR"/>
         </w:rPr>
-        <w:t xml:space="preserve">JULIÁN BERMÚDEZ · THE CHANNEL</w:t>
+        <w:t xml:space="preserve">JULIÁN BERMÚDEZ</w:t>
       </w:r>
     </w:p>
     <w:p>
@@ -3537,7 +3537,7 @@
           <w:szCs w:val="14"/>
           <w:lang w:val="es-AR"/>
         </w:rPr>
-        <w:t xml:space="preserve">JULIÁN BERMÚDEZ · THE CHANNEL</w:t>
+        <w:t xml:space="preserve">JULIÁN BERMÚDEZ</w:t>
       </w:r>
     </w:p>
     <w:p>
@@ -4363,7 +4363,7 @@
           <w:szCs w:val="14"/>
           <w:lang w:val="es-AR"/>
         </w:rPr>
-        <w:t xml:space="preserve">JULIÁN BERMÚDEZ · THE CHANNEL</w:t>
+        <w:t xml:space="preserve">JULIÁN BERMÚDEZ</w:t>
       </w:r>
     </w:p>
     <w:p>
@@ -4796,7 +4796,7 @@
           <w:szCs w:val="14"/>
           <w:lang w:val="es-AR"/>
         </w:rPr>
-        <w:t xml:space="preserve">JULIÁN BERMÚDEZ · THE CHANNEL</w:t>
+        <w:t xml:space="preserve">JULIÁN BERMÚDEZ</w:t>
       </w:r>
     </w:p>
     <w:p>

</xml_diff>

<commit_message>
Libros: en Pensamiento, la apertura de cada capítulo en la misma página que el texto
Como en la Receta y la Biografía: sin la divisoria negra aparte. El grabado
del capítulo en la tinta del libro sobre la página blanca, «CAPÍTULO N» y la
cita en gris, título y epígrafe en negro; los folios siguen empezando en 1.

Co-Authored-By: Claude Opus 5.5 <noreply@anthropic.com>
Claude-Session: https://claude.ai/code/session_014ZXCqSPyLGg43e9ivReU3y
</commit_message>
<xml_diff>
--- a/manuscritos/El Pensamiento es Tu Fe (edición integral con sitio, revisión 4).docx
+++ b/manuscritos/El Pensamiento es Tu Fe (edición integral con sitio, revisión 4).docx
@@ -1270,7 +1270,7 @@
       <w:r>
         <w:rPr>
           <w:rFonts w:ascii="Palatino Linotype" w:hAnsi="Palatino Linotype" w:cs="Palatino Linotype"/>
-          <w:color w:val="BDB5A3"/>
+          <w:color w:val="6E6A63"/>
           <w:spacing w:val="110"/>
           <w:sz w:val="19"/>
           <w:szCs w:val="19"/>
@@ -1288,7 +1288,7 @@
       <w:r>
         <w:rPr>
           <w:rFonts w:ascii="Palatino Linotype" w:hAnsi="Palatino Linotype" w:cs="Palatino Linotype"/>
-          <w:color w:val="F2EEE4"/>
+          <w:color w:val="2B2B2B"/>
           <w:spacing w:val="50"/>
           <w:sz w:val="33"/>
           <w:szCs w:val="33"/>
@@ -1309,7 +1309,7 @@
           <w:rFonts w:ascii="Palatino Linotype" w:hAnsi="Palatino Linotype" w:cs="Palatino Linotype"/>
           <w:i/>
           <w:iCs/>
-          <w:color w:val="F2EEE4"/>
+          <w:color w:val="2B2B2B"/>
           <w:sz w:val="21"/>
           <w:szCs w:val="21"/>
           <w:lang w:val="es-AR"/>
@@ -1322,22 +1322,12 @@
         <w:keepNext/>
         <w:spacing w:before="0" w:after="520"/>
         <w:jc w:val="center"/>
-        <w:sectPr>
-          <w:headerReference w:type="default" r:id="rIdJB15"/>
-          <w:headerReference w:type="even" r:id="rIdJB15"/>
-          <w:footerReference w:type="default" r:id="rIdJB41"/>
-          <w:footerReference w:type="even" r:id="rIdJB41"/>
-          <w:pgSz w:w="7920" w:h="12240"/>
-          <w:pgMar w:top="1080" w:right="792" w:bottom="1008" w:left="1080" w:header="560" w:footer="500" w:gutter="0"/>
-          <w:pgNumType w:start="1"/>
-          <w:cols w:space="720"/>
-        </w:sectPr>
       </w:pPr>
       <w:r>
         <w:rPr>
           <w:rFonts w:ascii="Palatino Linotype" w:hAnsi="Palatino Linotype" w:cs="Palatino Linotype"/>
           <w:smallCaps/>
-          <w:color w:val="BDB5A3"/>
+          <w:color w:val="6E6A63"/>
           <w:spacing w:val="40"/>
           <w:sz w:val="18"/>
           <w:szCs w:val="18"/>
@@ -1793,6 +1783,7 @@
           <w:footerReference w:type="first" r:id="rIdJB40"/>
           <w:pgSz w:w="7920" w:h="12240"/>
           <w:pgMar w:top="1080" w:right="792" w:bottom="1008" w:left="1080" w:header="560" w:footer="500" w:gutter="0"/>
+          <w:pgNumType w:start="1"/>
           <w:cols w:space="720"/>
           <w:titlePg/>
         </w:sectPr>
@@ -1957,7 +1948,7 @@
       <w:r>
         <w:rPr>
           <w:rFonts w:ascii="Palatino Linotype" w:hAnsi="Palatino Linotype" w:cs="Palatino Linotype"/>
-          <w:color w:val="BDB5A3"/>
+          <w:color w:val="6E6A63"/>
           <w:spacing w:val="110"/>
           <w:sz w:val="14"/>
           <w:szCs w:val="14"/>
@@ -2027,7 +2018,7 @@
       <w:r>
         <w:rPr>
           <w:rFonts w:ascii="Palatino Linotype" w:hAnsi="Palatino Linotype" w:cs="Palatino Linotype"/>
-          <w:color w:val="BDB5A3"/>
+          <w:color w:val="6E6A63"/>
           <w:spacing w:val="110"/>
           <w:sz w:val="19"/>
           <w:szCs w:val="19"/>
@@ -2046,7 +2037,7 @@
       <w:r>
         <w:rPr>
           <w:rFonts w:ascii="Palatino Linotype" w:hAnsi="Palatino Linotype" w:cs="Palatino Linotype"/>
-          <w:color w:val="F2EEE4"/>
+          <w:color w:val="2B2B2B"/>
           <w:spacing w:val="50"/>
           <w:sz w:val="33"/>
           <w:szCs w:val="33"/>
@@ -2067,7 +2058,7 @@
           <w:rFonts w:ascii="Palatino Linotype" w:hAnsi="Palatino Linotype" w:cs="Palatino Linotype"/>
           <w:i/>
           <w:iCs/>
-          <w:color w:val="F2EEE4"/>
+          <w:color w:val="2B2B2B"/>
           <w:sz w:val="21"/>
           <w:szCs w:val="21"/>
           <w:lang w:val="es-AR"/>
@@ -2080,21 +2071,12 @@
         <w:keepNext/>
         <w:spacing w:before="0" w:after="520"/>
         <w:jc w:val="center"/>
-        <w:sectPr>
-          <w:headerReference w:type="default" r:id="rIdJB15"/>
-          <w:headerReference w:type="even" r:id="rIdJB15"/>
-          <w:footerReference w:type="default" r:id="rIdJB41"/>
-          <w:footerReference w:type="even" r:id="rIdJB41"/>
-          <w:pgSz w:w="7920" w:h="12240"/>
-          <w:pgMar w:top="1080" w:right="792" w:bottom="1008" w:left="1080" w:header="560" w:footer="500" w:gutter="0"/>
-          <w:cols w:space="720"/>
-        </w:sectPr>
       </w:pPr>
       <w:r>
         <w:rPr>
           <w:rFonts w:ascii="Palatino Linotype" w:hAnsi="Palatino Linotype" w:cs="Palatino Linotype"/>
           <w:smallCaps/>
-          <w:color w:val="BDB5A3"/>
+          <w:color w:val="6E6A63"/>
           <w:spacing w:val="40"/>
           <w:sz w:val="18"/>
           <w:szCs w:val="18"/>
@@ -2795,7 +2777,7 @@
       <w:r>
         <w:rPr>
           <w:rFonts w:ascii="Palatino Linotype" w:hAnsi="Palatino Linotype" w:cs="Palatino Linotype"/>
-          <w:color w:val="BDB5A3"/>
+          <w:color w:val="6E6A63"/>
           <w:spacing w:val="110"/>
           <w:sz w:val="14"/>
           <w:szCs w:val="14"/>
@@ -2865,7 +2847,7 @@
       <w:r>
         <w:rPr>
           <w:rFonts w:ascii="Palatino Linotype" w:hAnsi="Palatino Linotype" w:cs="Palatino Linotype"/>
-          <w:color w:val="BDB5A3"/>
+          <w:color w:val="6E6A63"/>
           <w:spacing w:val="110"/>
           <w:sz w:val="19"/>
           <w:szCs w:val="19"/>
@@ -2884,7 +2866,7 @@
       <w:r>
         <w:rPr>
           <w:rFonts w:ascii="Palatino Linotype" w:hAnsi="Palatino Linotype" w:cs="Palatino Linotype"/>
-          <w:color w:val="F2EEE4"/>
+          <w:color w:val="2B2B2B"/>
           <w:spacing w:val="50"/>
           <w:sz w:val="33"/>
           <w:szCs w:val="33"/>
@@ -2905,7 +2887,7 @@
           <w:rFonts w:ascii="Palatino Linotype" w:hAnsi="Palatino Linotype" w:cs="Palatino Linotype"/>
           <w:i/>
           <w:iCs/>
-          <w:color w:val="F2EEE4"/>
+          <w:color w:val="2B2B2B"/>
           <w:sz w:val="21"/>
           <w:szCs w:val="21"/>
           <w:lang w:val="es-AR"/>
@@ -2923,7 +2905,7 @@
         <w:rPr>
           <w:rFonts w:ascii="Palatino Linotype" w:hAnsi="Palatino Linotype" w:cs="Palatino Linotype"/>
           <w:smallCaps/>
-          <w:color w:val="BDB5A3"/>
+          <w:color w:val="6E6A63"/>
           <w:spacing w:val="40"/>
           <w:sz w:val="18"/>
           <w:szCs w:val="18"/>
@@ -2936,22 +2918,13 @@
       <w:pPr>
         <w:spacing w:before="0" w:after="520"/>
         <w:jc w:val="center"/>
-        <w:sectPr>
-          <w:headerReference w:type="default" r:id="rIdJB15"/>
-          <w:headerReference w:type="even" r:id="rIdJB15"/>
-          <w:footerReference w:type="default" r:id="rIdJB41"/>
-          <w:footerReference w:type="even" r:id="rIdJB41"/>
-          <w:pgSz w:w="7920" w:h="12240"/>
-          <w:pgMar w:top="1080" w:right="792" w:bottom="1008" w:left="1080" w:header="560" w:footer="500" w:gutter="0"/>
-          <w:cols w:space="720"/>
-        </w:sectPr>
       </w:pPr>
       <w:r>
         <w:rPr>
           <w:rFonts w:ascii="Palatino Linotype" w:hAnsi="Palatino Linotype" w:cs="Palatino Linotype"/>
           <w:i/>
           <w:iCs/>
-          <w:color w:val="BDB5A3"/>
+          <w:color w:val="6E6A63"/>
           <w:sz w:val="15"/>
           <w:szCs w:val="15"/>
           <w:lang w:val="es-AR"/>
@@ -3531,7 +3504,7 @@
       <w:r>
         <w:rPr>
           <w:rFonts w:ascii="Palatino Linotype" w:hAnsi="Palatino Linotype" w:cs="Palatino Linotype"/>
-          <w:color w:val="BDB5A3"/>
+          <w:color w:val="6E6A63"/>
           <w:spacing w:val="110"/>
           <w:sz w:val="14"/>
           <w:szCs w:val="14"/>
@@ -3601,7 +3574,7 @@
       <w:r>
         <w:rPr>
           <w:rFonts w:ascii="Palatino Linotype" w:hAnsi="Palatino Linotype" w:cs="Palatino Linotype"/>
-          <w:color w:val="BDB5A3"/>
+          <w:color w:val="6E6A63"/>
           <w:spacing w:val="110"/>
           <w:sz w:val="19"/>
           <w:szCs w:val="19"/>
@@ -3619,7 +3592,7 @@
       <w:r>
         <w:rPr>
           <w:rFonts w:ascii="Palatino Linotype" w:hAnsi="Palatino Linotype" w:cs="Palatino Linotype"/>
-          <w:color w:val="F2EEE4"/>
+          <w:color w:val="2B2B2B"/>
           <w:spacing w:val="50"/>
           <w:sz w:val="33"/>
           <w:szCs w:val="33"/>
@@ -3640,7 +3613,7 @@
           <w:rFonts w:ascii="Palatino Linotype" w:hAnsi="Palatino Linotype" w:cs="Palatino Linotype"/>
           <w:i/>
           <w:iCs/>
-          <w:color w:val="F2EEE4"/>
+          <w:color w:val="2B2B2B"/>
           <w:sz w:val="21"/>
           <w:szCs w:val="21"/>
           <w:lang w:val="es-AR"/>
@@ -3658,7 +3631,7 @@
         <w:rPr>
           <w:rFonts w:ascii="Palatino Linotype" w:hAnsi="Palatino Linotype" w:cs="Palatino Linotype"/>
           <w:smallCaps/>
-          <w:color w:val="BDB5A3"/>
+          <w:color w:val="6E6A63"/>
           <w:spacing w:val="40"/>
           <w:sz w:val="18"/>
           <w:szCs w:val="18"/>
@@ -3671,22 +3644,13 @@
       <w:pPr>
         <w:spacing w:before="0" w:after="520"/>
         <w:jc w:val="center"/>
-        <w:sectPr>
-          <w:headerReference w:type="default" r:id="rIdJB15"/>
-          <w:headerReference w:type="even" r:id="rIdJB15"/>
-          <w:footerReference w:type="default" r:id="rIdJB41"/>
-          <w:footerReference w:type="even" r:id="rIdJB41"/>
-          <w:pgSz w:w="7920" w:h="12240"/>
-          <w:pgMar w:top="1080" w:right="792" w:bottom="1008" w:left="1080" w:header="560" w:footer="500" w:gutter="0"/>
-          <w:cols w:space="720"/>
-        </w:sectPr>
       </w:pPr>
       <w:r>
         <w:rPr>
           <w:rFonts w:ascii="Palatino Linotype" w:hAnsi="Palatino Linotype" w:cs="Palatino Linotype"/>
           <w:i/>
           <w:iCs/>
-          <w:color w:val="BDB5A3"/>
+          <w:color w:val="6E6A63"/>
           <w:sz w:val="15"/>
           <w:szCs w:val="15"/>
           <w:lang w:val="es-AR"/>
@@ -4357,7 +4321,7 @@
       <w:r>
         <w:rPr>
           <w:rFonts w:ascii="Palatino Linotype" w:hAnsi="Palatino Linotype" w:cs="Palatino Linotype"/>
-          <w:color w:val="BDB5A3"/>
+          <w:color w:val="6E6A63"/>
           <w:spacing w:val="110"/>
           <w:sz w:val="14"/>
           <w:szCs w:val="14"/>
@@ -4427,7 +4391,7 @@
       <w:r>
         <w:rPr>
           <w:rFonts w:ascii="Palatino Linotype" w:hAnsi="Palatino Linotype" w:cs="Palatino Linotype"/>
-          <w:color w:val="BDB5A3"/>
+          <w:color w:val="6E6A63"/>
           <w:spacing w:val="110"/>
           <w:sz w:val="19"/>
           <w:szCs w:val="19"/>
@@ -4445,7 +4409,7 @@
       <w:r>
         <w:rPr>
           <w:rFonts w:ascii="Palatino Linotype" w:hAnsi="Palatino Linotype" w:cs="Palatino Linotype"/>
-          <w:color w:val="F2EEE4"/>
+          <w:color w:val="2B2B2B"/>
           <w:spacing w:val="50"/>
           <w:sz w:val="33"/>
           <w:szCs w:val="33"/>
@@ -4466,7 +4430,7 @@
           <w:rFonts w:ascii="Palatino Linotype" w:hAnsi="Palatino Linotype" w:cs="Palatino Linotype"/>
           <w:i/>
           <w:iCs/>
-          <w:color w:val="F2EEE4"/>
+          <w:color w:val="2B2B2B"/>
           <w:sz w:val="21"/>
           <w:szCs w:val="21"/>
           <w:lang w:val="es-AR"/>
@@ -4484,7 +4448,7 @@
         <w:rPr>
           <w:rFonts w:ascii="Palatino Linotype" w:hAnsi="Palatino Linotype" w:cs="Palatino Linotype"/>
           <w:smallCaps/>
-          <w:color w:val="BDB5A3"/>
+          <w:color w:val="6E6A63"/>
           <w:spacing w:val="40"/>
           <w:sz w:val="18"/>
           <w:szCs w:val="18"/>
@@ -4497,22 +4461,13 @@
       <w:pPr>
         <w:spacing w:before="0" w:after="520"/>
         <w:jc w:val="center"/>
-        <w:sectPr>
-          <w:headerReference w:type="default" r:id="rIdJB15"/>
-          <w:headerReference w:type="even" r:id="rIdJB15"/>
-          <w:footerReference w:type="default" r:id="rIdJB41"/>
-          <w:footerReference w:type="even" r:id="rIdJB41"/>
-          <w:pgSz w:w="7920" w:h="12240"/>
-          <w:pgMar w:top="1080" w:right="792" w:bottom="1008" w:left="1080" w:header="560" w:footer="500" w:gutter="0"/>
-          <w:cols w:space="720"/>
-        </w:sectPr>
       </w:pPr>
       <w:r>
         <w:rPr>
           <w:rFonts w:ascii="Palatino Linotype" w:hAnsi="Palatino Linotype" w:cs="Palatino Linotype"/>
           <w:i/>
           <w:iCs/>
-          <w:color w:val="BDB5A3"/>
+          <w:color w:val="6E6A63"/>
           <w:sz w:val="15"/>
           <w:szCs w:val="15"/>
           <w:lang w:val="es-AR"/>
@@ -4790,7 +4745,7 @@
       <w:r>
         <w:rPr>
           <w:rFonts w:ascii="Palatino Linotype" w:hAnsi="Palatino Linotype" w:cs="Palatino Linotype"/>
-          <w:color w:val="BDB5A3"/>
+          <w:color w:val="6E6A63"/>
           <w:spacing w:val="110"/>
           <w:sz w:val="14"/>
           <w:szCs w:val="14"/>
@@ -4860,7 +4815,7 @@
       <w:r>
         <w:rPr>
           <w:rFonts w:ascii="Palatino Linotype" w:hAnsi="Palatino Linotype" w:cs="Palatino Linotype"/>
-          <w:color w:val="BDB5A3"/>
+          <w:color w:val="6E6A63"/>
           <w:spacing w:val="110"/>
           <w:sz w:val="19"/>
           <w:szCs w:val="19"/>
@@ -4878,7 +4833,7 @@
       <w:r>
         <w:rPr>
           <w:rFonts w:ascii="Palatino Linotype" w:hAnsi="Palatino Linotype" w:cs="Palatino Linotype"/>
-          <w:color w:val="F2EEE4"/>
+          <w:color w:val="2B2B2B"/>
           <w:spacing w:val="50"/>
           <w:sz w:val="33"/>
           <w:szCs w:val="33"/>
@@ -4899,7 +4854,7 @@
           <w:rFonts w:ascii="Palatino Linotype" w:hAnsi="Palatino Linotype" w:cs="Palatino Linotype"/>
           <w:i/>
           <w:iCs/>
-          <w:color w:val="F2EEE4"/>
+          <w:color w:val="2B2B2B"/>
           <w:sz w:val="21"/>
           <w:szCs w:val="21"/>
           <w:lang w:val="es-AR"/>
@@ -4917,7 +4872,7 @@
         <w:rPr>
           <w:rFonts w:ascii="Palatino Linotype" w:hAnsi="Palatino Linotype" w:cs="Palatino Linotype"/>
           <w:smallCaps/>
-          <w:color w:val="BDB5A3"/>
+          <w:color w:val="6E6A63"/>
           <w:spacing w:val="40"/>
           <w:sz w:val="18"/>
           <w:szCs w:val="18"/>
@@ -4930,22 +4885,13 @@
       <w:pPr>
         <w:spacing w:before="0" w:after="520"/>
         <w:jc w:val="center"/>
-        <w:sectPr>
-          <w:headerReference w:type="default" r:id="rIdJB15"/>
-          <w:headerReference w:type="even" r:id="rIdJB15"/>
-          <w:footerReference w:type="default" r:id="rIdJB41"/>
-          <w:footerReference w:type="even" r:id="rIdJB41"/>
-          <w:pgSz w:w="7920" w:h="12240"/>
-          <w:pgMar w:top="1080" w:right="792" w:bottom="1008" w:left="1080" w:header="560" w:footer="500" w:gutter="0"/>
-          <w:cols w:space="720"/>
-        </w:sectPr>
       </w:pPr>
       <w:r>
         <w:rPr>
           <w:rFonts w:ascii="Palatino Linotype" w:hAnsi="Palatino Linotype" w:cs="Palatino Linotype"/>
           <w:i/>
           <w:iCs/>
-          <w:color w:val="BDB5A3"/>
+          <w:color w:val="6E6A63"/>
           <w:sz w:val="15"/>
           <w:szCs w:val="15"/>
           <w:lang w:val="es-AR"/>
@@ -5417,7 +5363,7 @@
       <w:r>
         <w:rPr>
           <w:rFonts w:ascii="Palatino Linotype" w:hAnsi="Palatino Linotype" w:cs="Palatino Linotype"/>
-          <w:color w:val="BDB5A3"/>
+          <w:color w:val="6E6A63"/>
           <w:spacing w:val="110"/>
           <w:sz w:val="19"/>
           <w:szCs w:val="19"/>
@@ -5436,7 +5382,7 @@
       <w:r>
         <w:rPr>
           <w:rFonts w:ascii="Palatino Linotype" w:hAnsi="Palatino Linotype" w:cs="Palatino Linotype"/>
-          <w:color w:val="F2EEE4"/>
+          <w:color w:val="2B2B2B"/>
           <w:spacing w:val="50"/>
           <w:sz w:val="33"/>
           <w:szCs w:val="33"/>
@@ -5457,7 +5403,7 @@
           <w:rFonts w:ascii="Palatino Linotype" w:hAnsi="Palatino Linotype" w:cs="Palatino Linotype"/>
           <w:i/>
           <w:iCs/>
-          <w:color w:val="F2EEE4"/>
+          <w:color w:val="2B2B2B"/>
           <w:sz w:val="21"/>
           <w:szCs w:val="21"/>
           <w:lang w:val="es-AR"/>
@@ -5470,21 +5416,12 @@
         <w:keepNext/>
         <w:spacing w:before="0" w:after="520"/>
         <w:jc w:val="center"/>
-        <w:sectPr>
-          <w:headerReference w:type="default" r:id="rIdJB15"/>
-          <w:headerReference w:type="even" r:id="rIdJB15"/>
-          <w:footerReference w:type="default" r:id="rIdJB41"/>
-          <w:footerReference w:type="even" r:id="rIdJB41"/>
-          <w:pgSz w:w="7920" w:h="12240"/>
-          <w:pgMar w:top="1080" w:right="792" w:bottom="1008" w:left="1080" w:header="560" w:footer="500" w:gutter="0"/>
-          <w:cols w:space="720"/>
-        </w:sectPr>
       </w:pPr>
       <w:r>
         <w:rPr>
           <w:rFonts w:ascii="Palatino Linotype" w:hAnsi="Palatino Linotype" w:cs="Palatino Linotype"/>
           <w:smallCaps/>
-          <w:color w:val="BDB5A3"/>
+          <w:color w:val="6E6A63"/>
           <w:spacing w:val="40"/>
           <w:sz w:val="18"/>
           <w:szCs w:val="18"/>

</xml_diff>